<commit_message>
Audit fixes: hashtag strategy article
Co-Authored-By: Claude Opus 5.5 <noreply@anthropic.com>
Claude-Session: https://claude.ai/code/session_01GQXcnZLn4f9MkUS7SEqp5J
</commit_message>
<xml_diff>
--- a/blog-content/Instagram-Hashtag-Strategy-for-Business.docx
+++ b/blog-content/Instagram-Hashtag-Strategy-for-Business.docx
@@ -151,9 +151,9 @@
           <w:sz w:val="24"/>
           <w:szCs w:val="24"/>
         </w:rPr>
-        <w:t xml:space="preserve">That makes hashtags simpler, not useless. This guide shows how to choose five that describe your post accurately and reach the people who might actually buy from you, with a ready-made set for six common types of business. It's part of our </w:t>
-      </w:r>
-      <w:hyperlink w:history="1" r:id="rIdenluayd2vykhrqekobmzb">
+        <w:t xml:space="preserve">Hashtags still have a job, and with only five slots it's easier to do well. This guide shows how to choose five that describe your post accurately and reach the people who might actually buy from you, with a ready-made set for six common types of business. It's part of our </w:t>
+      </w:r>
+      <w:hyperlink w:history="1" r:id="rIdtpgsuzo-zdd5bqtso7rli">
         <w:r>
           <w:rPr>
             <w:rStyle w:val="Hyperlink"/>
@@ -204,7 +204,7 @@
           <w:sz w:val="24"/>
           <w:szCs w:val="24"/>
         </w:rPr>
-        <w:t xml:space="preserve">Yes, but as labels, not as a reach booster. Hashtags tell Instagram what a post is about and help people who search or follow that topic find it. They won't push an average post to thousands of new people.</w:t>
+        <w:t xml:space="preserve">Yes, as labels. Hashtags tell Instagram what a post is about and help people who search or follow that topic find it. They won't push an average post to thousands of new people; the post itself does most of that work.</w:t>
       </w:r>
     </w:p>
     <w:p>
@@ -247,9 +247,9 @@
           <w:sz w:val="24"/>
           <w:szCs w:val="24"/>
         </w:rPr>
-        <w:t xml:space="preserve"> In December 2025 Instagram told users it "will gradually update the number of hashtags that you can include in a caption for a reel or post to five", replacing the old limit of 30, as </w:t>
-      </w:r>
-      <w:hyperlink w:history="1" r:id="rIdh84xrviqlw0cmbyse2izl">
+        <w:t xml:space="preserve"> After a year of tests, some of which limited users to three tags, in December 2025 Instagram told users it "will gradually update the number of hashtags that you can include in a caption for a reel or post to five", replacing the old limit of 30, as </w:t>
+      </w:r>
+      <w:hyperlink w:history="1" r:id="rIdwekdcvpul6bg8rzf4m-mp">
         <w:r>
           <w:rPr>
             <w:rStyle w:val="Hyperlink"/>
@@ -298,7 +298,7 @@
           <w:sz w:val="24"/>
           <w:szCs w:val="24"/>
         </w:rPr>
-        <w:t xml:space="preserve"> Instagram chief Adam Mosseri has said several times that hashtags don't increase reach, but are a good way to let people know what a post is about (same report).</w:t>
+        <w:t xml:space="preserve"> Instagram chief Adam Mosseri said in February and again in May 2025 that hashtags don't improve reach, while describing them as a way to say what a post is about (same report).</w:t>
       </w:r>
     </w:p>
     <w:p>
@@ -343,7 +343,7 @@
           <w:sz w:val="24"/>
           <w:szCs w:val="24"/>
         </w:rPr>
-        <w:t xml:space="preserve">Use up to five on posts and Reels; that's the maximum Instagram allows. Three to five accurate tags is a sensible range. Using fewer is fine when there aren't five that genuinely fit; a vague tag added to fill a slot only blurs what the post is about.</w:t>
+        <w:t xml:space="preserve">Use up to five on posts and Reels, including carousels; that's the maximum Instagram allows. Three to five accurate tags is a sensible range. Using fewer is fine when there aren't five that genuinely fit; a vague tag added to fill a slot only blurs what the post is about.</w:t>
       </w:r>
     </w:p>
     <w:p>
@@ -847,7 +847,7 @@
         </w:rPr>
         <w:t xml:space="preserve">, with a capital letter at the start of each word (#VeganBaking, not #veganbaking). The University of Kentucky's </w:t>
       </w:r>
-      <w:hyperlink w:history="1" r:id="rIdvaxs967tuit81x6-5xchv">
+      <w:hyperlink w:history="1" r:id="rIdj-tianodpmxjptjpdqhgn">
         <w:r>
           <w:rPr>
             <w:rStyle w:val="Hyperlink"/>
@@ -867,7 +867,7 @@
           <w:sz w:val="24"/>
           <w:szCs w:val="24"/>
         </w:rPr>
-        <w:t xml:space="preserve"> recommends it because screen readers can then read the words separately. It's also easier for everyone to read.</w:t>
+        <w:t xml:space="preserve"> recommends it because screen readers can then read the words separately. It's also easier for everyone to read. Keep each tag to letters and numbers: spaces and symbols such as $ or % break a hashtag.</w:t>
       </w:r>
     </w:p>
     <w:p>
@@ -1050,7 +1050,7 @@
         </w:rPr>
         <w:t xml:space="preserve"> Our free </w:t>
       </w:r>
-      <w:hyperlink w:history="1" r:id="rIddx-hnto2wkafiihxur0q5">
+      <w:hyperlink w:history="1" r:id="rIdi73adc7mzqpwczxqldweg">
         <w:r>
           <w:rPr>
             <w:rStyle w:val="Hyperlink"/>
@@ -1247,7 +1247,7 @@
           <w:sz w:val="24"/>
           <w:szCs w:val="24"/>
         </w:rPr>
-        <w:t xml:space="preserve">Keep it short, easy to spell and clearly yours. Put it in your bio and on packaging, menus or receipts so customers know it exists. If you want to reshare a customer's photo, ask their permission first and credit them in the caption.</w:t>
+        <w:t xml:space="preserve">Keep it short, easy to spell and clearly yours. Print it on packaging, menus or receipts so customers know it exists. Before you choose one, search it in Instagram to make sure no one else is already using it for something unrelated. If you want to reshare a customer's photo, ask their permission first and credit them in the caption.</w:t>
       </w:r>
     </w:p>
     <w:p>
@@ -1956,7 +1956,7 @@
           <w:sz w:val="24"/>
           <w:szCs w:val="24"/>
         </w:rPr>
-        <w:t xml:space="preserve"> using only creator-community tags such as #BloggersOfInstagram. They connect you with other bloggers, which is useful for networking but rarely brings readers. If the post is sponsored or gifted, label it as an ad as well; tags like #Ad don't count towards discovery, but they are part of being honest with your audience.</w:t>
+        <w:t xml:space="preserve"> using only creator-community tags such as #BloggersOfInstagram. They connect you with other bloggers, which is useful for networking but rarely brings readers. If a post is sponsored or gifted, it must be clearly labelled as an ad. Instagram's paid partnership label does this without using a hashtag; if you use #Ad instead, it takes one of your five slots.</w:t>
       </w:r>
     </w:p>
     <w:p>
@@ -2094,16 +2094,16 @@
           <w:sz w:val="24"/>
           <w:szCs w:val="24"/>
         </w:rPr>
-        <w:t xml:space="preserve">Using restricted tags.</w:t>
-      </w:r>
-      <w:r>
-        <w:rPr>
-          <w:rFonts w:ascii="Calibri" w:cs="Calibri" w:eastAsia="Calibri" w:hAnsi="Calibri"/>
-          <w:color w:val="333333"/>
-          <w:sz w:val="24"/>
-          <w:szCs w:val="24"/>
-        </w:rPr>
-        <w:t xml:space="preserve"> Check each tag's page before using it, as in step 3.</w:t>
+        <w:t xml:space="preserve">Expecting hashtags to work on a private account.</w:t>
+      </w:r>
+      <w:r>
+        <w:rPr>
+          <w:rFonts w:ascii="Calibri" w:cs="Calibri" w:eastAsia="Calibri" w:hAnsi="Calibri"/>
+          <w:color w:val="333333"/>
+          <w:sz w:val="24"/>
+          <w:szCs w:val="24"/>
+        </w:rPr>
+        <w:t xml:space="preserve"> Posts from private accounts don't appear on hashtag pages, so hashtags only help public profiles.</w:t>
       </w:r>
     </w:p>
     <w:p>
@@ -2123,35 +2123,6 @@
           <w:sz w:val="24"/>
           <w:szCs w:val="24"/>
         </w:rPr>
-        <w:t xml:space="preserve">Hiding hashtags on a private account.</w:t>
-      </w:r>
-      <w:r>
-        <w:rPr>
-          <w:rFonts w:ascii="Calibri" w:cs="Calibri" w:eastAsia="Calibri" w:hAnsi="Calibri"/>
-          <w:color w:val="333333"/>
-          <w:sz w:val="24"/>
-          <w:szCs w:val="24"/>
-        </w:rPr>
-        <w:t xml:space="preserve"> Posts from private accounts don't appear on hashtag pages, so hashtags only help public profiles.</w:t>
-      </w:r>
-    </w:p>
-    <w:p>
-      <w:pPr>
-        <w:pStyle w:val="ListParagraph"/>
-        <w:numPr>
-          <w:ilvl w:val="0"/>
-          <w:numId w:val="1"/>
-        </w:numPr>
-      </w:pPr>
-      <w:r>
-        <w:rPr>
-          <w:rFonts w:ascii="Calibri" w:cs="Calibri" w:eastAsia="Calibri" w:hAnsi="Calibri"/>
-          <w:b/>
-          <w:bCs/>
-          <w:color w:val="333333"/>
-          <w:sz w:val="24"/>
-          <w:szCs w:val="24"/>
-        </w:rPr>
         <w:t xml:space="preserve">Expecting hashtags to fix weak posts.</w:t>
       </w:r>
       <w:r>
@@ -2163,7 +2134,7 @@
         </w:rPr>
         <w:t xml:space="preserve"> The caption and the content still do most of the work. Our guide to </w:t>
       </w:r>
-      <w:hyperlink w:history="1" r:id="rIdwv1irkrw7kc_cs4msheo9">
+      <w:hyperlink w:history="1" r:id="rIdfieufj96u_9g1dtgfb44j">
         <w:r>
           <w:rPr>
             <w:rStyle w:val="Hyperlink"/>
@@ -2440,7 +2411,7 @@
         </w:rPr>
         <w:t xml:space="preserve">You can, but don't rely on them. Stories don't appear on hashtag pages the way posts do, as </w:t>
       </w:r>
-      <w:hyperlink w:history="1" r:id="rIdzc8iuxaggspvawsy2vlfr">
+      <w:hyperlink w:history="1" r:id="rIdzgwq8d8ie4jdept9yl2wu">
         <w:r>
           <w:rPr>
             <w:rStyle w:val="Hyperlink"/>
@@ -2493,7 +2464,7 @@
         </w:rPr>
         <w:t xml:space="preserve">Only your branded hashtag, if you have one. A hashtag in a bio becomes a clickable link to that hashtag's page, so a generic tag would send visitors away from your profile to other accounts' posts. Our free </w:t>
       </w:r>
-      <w:hyperlink w:history="1" r:id="rId-b5qa_2thwerzd3jvvcp9">
+      <w:hyperlink w:history="1" r:id="rIdxtanroavan6fp8fmqzspq">
         <w:r>
           <w:rPr>
             <w:rStyle w:val="Hyperlink"/>

</xml_diff>